<commit_message>
Update index.html with latest assets
</commit_message>
<xml_diff>
--- a/dist/clbinfo/papersanetdn/gioiThieu.docx
+++ b/dist/clbinfo/papersanetdn/gioiThieu.docx
@@ -1,117 +1,51 @@
 
 <file path=word/document.xml><?xml version="1.0" encoding="utf-8"?>
-<w:document xmlns:mc="http://schemas.openxmlformats.org/markup-compatibility/2006" xmlns:o="urn:schemas-microsoft-com:office:office" xmlns:r="http://schemas.openxmlformats.org/officeDocument/2006/relationships" xmlns:m="http://schemas.openxmlformats.org/officeDocument/2006/math" xmlns:v="urn:schemas-microsoft-com:vml" xmlns:wp="http://schemas.openxmlformats.org/drawingml/2006/wordprocessingDrawing" xmlns:w10="urn:schemas-microsoft-com:office:word" xmlns:w="http://schemas.openxmlformats.org/wordprocessingml/2006/main" xmlns:wne="http://schemas.microsoft.com/office/word/2006/wordml" xmlns:sl="http://schemas.openxmlformats.org/schemaLibrary/2006/main" xmlns:a="http://schemas.openxmlformats.org/drawingml/2006/main" xmlns:pic="http://schemas.openxmlformats.org/drawingml/2006/picture" xmlns:c="http://schemas.openxmlformats.org/drawingml/2006/chart" xmlns:lc="http://schemas.openxmlformats.org/drawingml/2006/lockedCanvas" xmlns:dgm="http://schemas.openxmlformats.org/drawingml/2006/diagram" xmlns:wps="http://schemas.microsoft.com/office/word/2010/wordprocessingShape" xmlns:wpg="http://schemas.microsoft.com/office/word/2010/wordprocessingGroup" xmlns:w14="http://schemas.microsoft.com/office/word/2010/wordml" xmlns:w15="http://schemas.microsoft.com/office/word/2012/wordml" xmlns:w16="http://schemas.microsoft.com/office/word/2018/wordml" xmlns:w16cex="http://schemas.microsoft.com/office/word/2018/wordml/cex" xmlns:w16cid="http://schemas.microsoft.com/office/word/2016/wordml/cid" xmlns:cr="http://schemas.microsoft.com/office/comments/2020/reactions">
+<w:document xmlns:wpc="http://schemas.microsoft.com/office/word/2010/wordprocessingCanvas" xmlns:cx="http://schemas.microsoft.com/office/drawing/2014/chartex" xmlns:cx1="http://schemas.microsoft.com/office/drawing/2015/9/8/chartex" xmlns:cx2="http://schemas.microsoft.com/office/drawing/2015/10/21/chartex" xmlns:cx3="http://schemas.microsoft.com/office/drawing/2016/5/9/chartex" xmlns:cx4="http://schemas.microsoft.com/office/drawing/2016/5/10/chartex" xmlns:cx5="http://schemas.microsoft.com/office/drawing/2016/5/11/chartex" xmlns:cx6="http://schemas.microsoft.com/office/drawing/2016/5/12/chartex" xmlns:cx7="http://schemas.microsoft.com/office/drawing/2016/5/13/chartex" xmlns:cx8="http://schemas.microsoft.com/office/drawing/2016/5/14/chartex" xmlns:mc="http://schemas.openxmlformats.org/markup-compatibility/2006" xmlns:aink="http://schemas.microsoft.com/office/drawing/2016/ink" xmlns:am3d="http://schemas.microsoft.com/office/drawing/2017/model3d" xmlns:o="urn:schemas-microsoft-com:office:office" xmlns:oel="http://schemas.microsoft.com/office/2019/extlst" xmlns:r="http://schemas.openxmlformats.org/officeDocument/2006/relationships" xmlns:m="http://schemas.openxmlformats.org/officeDocument/2006/math" xmlns:v="urn:schemas-microsoft-com:vml" xmlns:wp14="http://schemas.microsoft.com/office/word/2010/wordprocessingDrawing" xmlns:wp="http://schemas.openxmlformats.org/drawingml/2006/wordprocessingDrawing" xmlns:w10="urn:schemas-microsoft-com:office:word" xmlns:w="http://schemas.openxmlformats.org/wordprocessingml/2006/main" xmlns:w14="http://schemas.microsoft.com/office/word/2010/wordml" xmlns:w15="http://schemas.microsoft.com/office/word/2012/wordml" xmlns:w16cex="http://schemas.microsoft.com/office/word/2018/wordml/cex" xmlns:w16cid="http://schemas.microsoft.com/office/word/2016/wordml/cid" xmlns:w16="http://schemas.microsoft.com/office/word/2018/wordml" xmlns:w16sdtdh="http://schemas.microsoft.com/office/word/2020/wordml/sdtdatahash" xmlns:w16se="http://schemas.microsoft.com/office/word/2015/wordml/symex" xmlns:wpg="http://schemas.microsoft.com/office/word/2010/wordprocessingGroup" xmlns:wpi="http://schemas.microsoft.com/office/word/2010/wordprocessingInk" xmlns:wne="http://schemas.microsoft.com/office/word/2006/wordml" xmlns:wps="http://schemas.microsoft.com/office/word/2010/wordprocessingShape" mc:Ignorable="w14 w15 w16se w16cid w16 w16cex w16sdtdh wp14">
   <w:body>
     <w:p>
       <w:pPr>
         <w:rPr>
-          <w:rFonts w:ascii="Barlow" w:cs="Barlow" w:eastAsia="Barlow" w:hAnsi="Barlow"/>
+          <w:rFonts w:ascii="Nunito" w:eastAsia="Nunito" w:hAnsi="Nunito" w:cs="Nunito"/>
           <w:sz w:val="26"/>
           <w:szCs w:val="26"/>
         </w:rPr>
       </w:pPr>
       <w:r>
         <w:rPr>
-          <w:rtl w:val="0"/>
-        </w:rPr>
-      </w:r>
-    </w:p>
-    <w:p>
-      <w:pPr>
-        <w:rPr>
-          <w:rFonts w:ascii="Barlow" w:cs="Barlow" w:eastAsia="Barlow" w:hAnsi="Barlow"/>
+          <w:rFonts w:ascii="Barlow" w:eastAsia="Barlow" w:hAnsi="Barlow" w:cs="Barlow"/>
           <w:sz w:val="26"/>
           <w:szCs w:val="26"/>
         </w:rPr>
-      </w:pPr>
+        <w:t xml:space="preserve">Câu lạc bộ Sách Papersane Trường THPT Chuyên Trần Đại Nghĩa được thành lập nhằm mục đích </w:t>
+      </w:r>
       <w:r>
         <w:rPr>
-          <w:rtl w:val="0"/>
-        </w:rPr>
-      </w:r>
-    </w:p>
-    <w:p>
-      <w:pPr>
-        <w:rPr>
-          <w:rFonts w:ascii="Barlow" w:cs="Barlow" w:eastAsia="Barlow" w:hAnsi="Barlow"/>
+          <w:rFonts w:ascii="Nunito" w:eastAsia="Nunito" w:hAnsi="Nunito" w:cs="Nunito"/>
           <w:sz w:val="26"/>
           <w:szCs w:val="26"/>
         </w:rPr>
-      </w:pPr>
-      <w:r>
-        <w:rPr>
-          <w:rtl w:val="0"/>
-        </w:rPr>
-      </w:r>
-    </w:p>
-    <w:p>
-      <w:pPr>
-        <w:rPr>
-          <w:rFonts w:ascii="Barlow" w:cs="Barlow" w:eastAsia="Barlow" w:hAnsi="Barlow"/>
-          <w:sz w:val="26"/>
-          <w:szCs w:val="26"/>
-        </w:rPr>
-      </w:pPr>
-      <w:r>
-        <w:rPr>
-          <w:rtl w:val="0"/>
-        </w:rPr>
-      </w:r>
-    </w:p>
-    <w:p>
-      <w:pPr>
-        <w:rPr>
-          <w:rFonts w:ascii="Barlow" w:cs="Barlow" w:eastAsia="Barlow" w:hAnsi="Barlow"/>
-          <w:sz w:val="26"/>
-          <w:szCs w:val="26"/>
-        </w:rPr>
-      </w:pPr>
-      <w:r>
-        <w:rPr>
-          <w:rtl w:val="0"/>
-        </w:rPr>
-      </w:r>
-    </w:p>
-    <w:p>
-      <w:pPr>
-        <w:rPr>
-          <w:rFonts w:ascii="Nunito" w:cs="Nunito" w:eastAsia="Nunito" w:hAnsi="Nunito"/>
-          <w:sz w:val="26"/>
-          <w:szCs w:val="26"/>
-        </w:rPr>
-      </w:pPr>
-      <w:r>
-        <w:rPr>
-          <w:rFonts w:ascii="Nunito" w:cs="Nunito" w:eastAsia="Nunito" w:hAnsi="Nunito"/>
-          <w:sz w:val="26"/>
-          <w:szCs w:val="26"/>
-          <w:rtl w:val="0"/>
-        </w:rPr>
-        <w:t xml:space="preserve">The Papersane Reading Club of Tran Dai Nghia High School for the Gifted was formally introduced with the intention of spreading reading culture and self-study spirit to students nationwide and Tran Dai Nghia High School for the Gifted in particular. The Club aims to bring a safe, dynamic and professional community and environment so that students can better yourselves via learning soft skills and specialized skills.</w:t>
+        <w:t>lan tỏa văn hóa đọc và tinh thần tự học đến các bạn học sinh trên cả nước nói chung và học sinh trường THPT Chuyên Trần Đại Nghĩa nói riêng. Câu lạc bộ mong muốn sẽ mang lại cho các bạn thành viên một cộng đồng và môi trường làm việc năng động, an toàn, và chuyên nghiệp để các bạn có thể phát triển bản thân thông qua việc học hỏi các kỹ năng mềm và kỹ năng chuyên môn.</w:t>
       </w:r>
     </w:p>
     <w:sectPr>
-      <w:pgSz w:h="16834" w:w="11909" w:orient="portrait"/>
-      <w:pgMar w:bottom="1440" w:top="1440" w:left="1440" w:right="1440" w:header="720" w:footer="720"/>
+      <w:pgSz w:w="11909" w:h="16834"/>
+      <w:pgMar w:top="1440" w:right="1440" w:bottom="1440" w:left="1440" w:header="720" w:footer="720" w:gutter="0"/>
       <w:pgNumType w:start="1"/>
+      <w:cols w:space="720"/>
     </w:sectPr>
   </w:body>
 </w:document>
 </file>
 
-<file path=word/numbering.xml><?xml version="1.0" encoding="utf-8"?>
-<w:numbering xmlns:mc="http://schemas.openxmlformats.org/markup-compatibility/2006" xmlns:o="urn:schemas-microsoft-com:office:office" xmlns:r="http://schemas.openxmlformats.org/officeDocument/2006/relationships" xmlns:m="http://schemas.openxmlformats.org/officeDocument/2006/math" xmlns:v="urn:schemas-microsoft-com:vml" xmlns:wp="http://schemas.openxmlformats.org/drawingml/2006/wordprocessingDrawing" xmlns:w10="urn:schemas-microsoft-com:office:word" xmlns:w="http://schemas.openxmlformats.org/wordprocessingml/2006/main" xmlns:wne="http://schemas.microsoft.com/office/word/2006/wordml" xmlns:sl="http://schemas.openxmlformats.org/schemaLibrary/2006/main" xmlns:a="http://schemas.openxmlformats.org/drawingml/2006/main" xmlns:pic="http://schemas.openxmlformats.org/drawingml/2006/picture" xmlns:c="http://schemas.openxmlformats.org/drawingml/2006/chart" xmlns:lc="http://schemas.openxmlformats.org/drawingml/2006/lockedCanvas" xmlns:dgm="http://schemas.openxmlformats.org/drawingml/2006/diagram" xmlns:wps="http://schemas.microsoft.com/office/word/2010/wordprocessingShape" xmlns:wpg="http://schemas.microsoft.com/office/word/2010/wordprocessingGroup" xmlns:w14="http://schemas.microsoft.com/office/word/2010/wordml" xmlns:w15="http://schemas.microsoft.com/office/word/2012/wordml" xmlns:w16="http://schemas.microsoft.com/office/word/2018/wordml" xmlns:w16cex="http://schemas.microsoft.com/office/word/2018/wordml/cex" xmlns:w16cid="http://schemas.microsoft.com/office/word/2016/wordml/cid" xmlns:cr="http://schemas.microsoft.com/office/comments/2020/reactions"/>
-</file>
-
 <file path=word/styles.xml><?xml version="1.0" encoding="utf-8"?>
-<w:styles xmlns:mc="http://schemas.openxmlformats.org/markup-compatibility/2006" xmlns:o="urn:schemas-microsoft-com:office:office" xmlns:r="http://schemas.openxmlformats.org/officeDocument/2006/relationships" xmlns:m="http://schemas.openxmlformats.org/officeDocument/2006/math" xmlns:v="urn:schemas-microsoft-com:vml" xmlns:wp="http://schemas.openxmlformats.org/drawingml/2006/wordprocessingDrawing" xmlns:w10="urn:schemas-microsoft-com:office:word" xmlns:w="http://schemas.openxmlformats.org/wordprocessingml/2006/main" xmlns:wne="http://schemas.microsoft.com/office/word/2006/wordml" xmlns:sl="http://schemas.openxmlformats.org/schemaLibrary/2006/main" xmlns:a="http://schemas.openxmlformats.org/drawingml/2006/main" xmlns:pic="http://schemas.openxmlformats.org/drawingml/2006/picture" xmlns:c="http://schemas.openxmlformats.org/drawingml/2006/chart" xmlns:lc="http://schemas.openxmlformats.org/drawingml/2006/lockedCanvas" xmlns:dgm="http://schemas.openxmlformats.org/drawingml/2006/diagram" xmlns:wps="http://schemas.microsoft.com/office/word/2010/wordprocessingShape" xmlns:wpg="http://schemas.microsoft.com/office/word/2010/wordprocessingGroup" xmlns:w14="http://schemas.microsoft.com/office/word/2010/wordml" xmlns:w15="http://schemas.microsoft.com/office/word/2012/wordml" xmlns:w16="http://schemas.microsoft.com/office/word/2018/wordml" xmlns:w16cex="http://schemas.microsoft.com/office/word/2018/wordml/cex" xmlns:w16cid="http://schemas.microsoft.com/office/word/2016/wordml/cid" xmlns:cr="http://schemas.microsoft.com/office/comments/2020/reactions">
+<w:styles xmlns:mc="http://schemas.openxmlformats.org/markup-compatibility/2006" xmlns:r="http://schemas.openxmlformats.org/officeDocument/2006/relationships" xmlns:w="http://schemas.openxmlformats.org/wordprocessingml/2006/main" xmlns:w14="http://schemas.microsoft.com/office/word/2010/wordml" xmlns:w15="http://schemas.microsoft.com/office/word/2012/wordml" xmlns:w16cex="http://schemas.microsoft.com/office/word/2018/wordml/cex" xmlns:w16cid="http://schemas.microsoft.com/office/word/2016/wordml/cid" xmlns:w16="http://schemas.microsoft.com/office/word/2018/wordml" xmlns:w16sdtdh="http://schemas.microsoft.com/office/word/2020/wordml/sdtdatahash" xmlns:w16se="http://schemas.microsoft.com/office/word/2015/wordml/symex" mc:Ignorable="w14 w15 w16se w16cid w16 w16cex w16sdtdh">
   <w:docDefaults>
     <w:rPrDefault>
       <w:rPr>
-        <w:rFonts w:ascii="Arial" w:cs="Arial" w:eastAsia="Arial" w:hAnsi="Arial"/>
+        <w:rFonts w:ascii="Arial" w:eastAsia="Arial" w:hAnsi="Arial" w:cs="Arial"/>
         <w:sz w:val="22"/>
         <w:szCs w:val="22"/>
-        <w:lang w:val="en-GB"/>
+        <w:lang w:val="en-GB" w:eastAsia="en-US" w:bidi="ar-SA"/>
       </w:rPr>
     </w:rPrDefault>
     <w:pPrDefault>
@@ -120,125 +54,398 @@
       </w:pPr>
     </w:pPrDefault>
   </w:docDefaults>
-  <w:style w:type="paragraph" w:styleId="Normal" w:default="1">
-    <w:name w:val="normal"/>
-  </w:style>
-  <w:style w:type="table" w:styleId="TableNormal" w:default="1">
-    <w:name w:val="Table Normal"/>
-  </w:style>
-  <w:style w:type="paragraph" w:styleId="Heading1">
-    <w:name w:val="heading 1"/>
-    <w:basedOn w:val="Normal"/>
-    <w:next w:val="Normal"/>
-    <w:pPr>
-      <w:keepNext w:val="1"/>
-      <w:keepLines w:val="1"/>
-      <w:spacing w:after="120" w:before="400" w:lineRule="auto"/>
-    </w:pPr>
-    <w:rPr>
-      <w:sz w:val="40"/>
-      <w:szCs w:val="40"/>
-    </w:rPr>
-  </w:style>
-  <w:style w:type="paragraph" w:styleId="Heading2">
-    <w:name w:val="heading 2"/>
-    <w:basedOn w:val="Normal"/>
-    <w:next w:val="Normal"/>
-    <w:pPr>
-      <w:keepNext w:val="1"/>
-      <w:keepLines w:val="1"/>
-      <w:spacing w:after="120" w:before="360" w:lineRule="auto"/>
-    </w:pPr>
-    <w:rPr>
-      <w:sz w:val="32"/>
-      <w:szCs w:val="32"/>
-    </w:rPr>
-  </w:style>
-  <w:style w:type="paragraph" w:styleId="Heading3">
-    <w:name w:val="heading 3"/>
-    <w:basedOn w:val="Normal"/>
-    <w:next w:val="Normal"/>
-    <w:pPr>
-      <w:keepNext w:val="1"/>
-      <w:keepLines w:val="1"/>
-      <w:spacing w:after="80" w:before="320" w:lineRule="auto"/>
-    </w:pPr>
-    <w:rPr>
-      <w:color w:val="434343"/>
-      <w:sz w:val="28"/>
-      <w:szCs w:val="28"/>
-    </w:rPr>
-  </w:style>
-  <w:style w:type="paragraph" w:styleId="Heading4">
-    <w:name w:val="heading 4"/>
-    <w:basedOn w:val="Normal"/>
-    <w:next w:val="Normal"/>
-    <w:pPr>
-      <w:keepNext w:val="1"/>
-      <w:keepLines w:val="1"/>
-      <w:spacing w:after="80" w:before="280" w:lineRule="auto"/>
-    </w:pPr>
-    <w:rPr>
-      <w:color w:val="666666"/>
-      <w:sz w:val="24"/>
-      <w:szCs w:val="24"/>
-    </w:rPr>
-  </w:style>
-  <w:style w:type="paragraph" w:styleId="Heading5">
-    <w:name w:val="heading 5"/>
-    <w:basedOn w:val="Normal"/>
-    <w:next w:val="Normal"/>
-    <w:pPr>
-      <w:keepNext w:val="1"/>
-      <w:keepLines w:val="1"/>
-      <w:spacing w:after="80" w:before="240" w:lineRule="auto"/>
-    </w:pPr>
-    <w:rPr>
-      <w:color w:val="666666"/>
-    </w:rPr>
-  </w:style>
-  <w:style w:type="paragraph" w:styleId="Heading6">
-    <w:name w:val="heading 6"/>
-    <w:basedOn w:val="Normal"/>
-    <w:next w:val="Normal"/>
-    <w:pPr>
-      <w:keepNext w:val="1"/>
-      <w:keepLines w:val="1"/>
-      <w:spacing w:after="80" w:before="240" w:lineRule="auto"/>
-    </w:pPr>
-    <w:rPr>
-      <w:i w:val="1"/>
-      <w:color w:val="666666"/>
-    </w:rPr>
-  </w:style>
-  <w:style w:type="paragraph" w:styleId="Title">
-    <w:name w:val="Title"/>
-    <w:basedOn w:val="Normal"/>
-    <w:next w:val="Normal"/>
-    <w:pPr>
-      <w:keepNext w:val="1"/>
-      <w:keepLines w:val="1"/>
-      <w:spacing w:after="60" w:lineRule="auto"/>
-    </w:pPr>
-    <w:rPr>
-      <w:sz w:val="52"/>
-      <w:szCs w:val="52"/>
-    </w:rPr>
-  </w:style>
-  <w:style w:type="paragraph" w:styleId="Normal" w:default="1">
+  <w:latentStyles w:defLockedState="0" w:defUIPriority="99" w:defSemiHidden="0" w:defUnhideWhenUsed="0" w:defQFormat="0" w:count="376">
+    <w:lsdException w:name="Normal" w:uiPriority="0" w:qFormat="1"/>
+    <w:lsdException w:name="heading 1" w:uiPriority="9" w:qFormat="1"/>
+    <w:lsdException w:name="heading 2" w:semiHidden="1" w:uiPriority="9" w:unhideWhenUsed="1" w:qFormat="1"/>
+    <w:lsdException w:name="heading 3" w:semiHidden="1" w:uiPriority="9" w:unhideWhenUsed="1" w:qFormat="1"/>
+    <w:lsdException w:name="heading 4" w:semiHidden="1" w:uiPriority="9" w:unhideWhenUsed="1" w:qFormat="1"/>
+    <w:lsdException w:name="heading 5" w:semiHidden="1" w:uiPriority="9" w:unhideWhenUsed="1" w:qFormat="1"/>
+    <w:lsdException w:name="heading 6" w:semiHidden="1" w:uiPriority="9" w:unhideWhenUsed="1" w:qFormat="1"/>
+    <w:lsdException w:name="heading 7" w:semiHidden="1" w:uiPriority="9" w:unhideWhenUsed="1" w:qFormat="1"/>
+    <w:lsdException w:name="heading 8" w:semiHidden="1" w:uiPriority="9" w:unhideWhenUsed="1" w:qFormat="1"/>
+    <w:lsdException w:name="heading 9" w:semiHidden="1" w:uiPriority="9" w:unhideWhenUsed="1" w:qFormat="1"/>
+    <w:lsdException w:name="index 1" w:semiHidden="1" w:unhideWhenUsed="1"/>
+    <w:lsdException w:name="index 2" w:semiHidden="1" w:unhideWhenUsed="1"/>
+    <w:lsdException w:name="index 3" w:semiHidden="1" w:unhideWhenUsed="1"/>
+    <w:lsdException w:name="index 4" w:semiHidden="1" w:unhideWhenUsed="1"/>
+    <w:lsdException w:name="index 5" w:semiHidden="1" w:unhideWhenUsed="1"/>
+    <w:lsdException w:name="index 6" w:semiHidden="1" w:unhideWhenUsed="1"/>
+    <w:lsdException w:name="index 7" w:semiHidden="1" w:unhideWhenUsed="1"/>
+    <w:lsdException w:name="index 8" w:semiHidden="1" w:unhideWhenUsed="1"/>
+    <w:lsdException w:name="index 9" w:semiHidden="1" w:unhideWhenUsed="1"/>
+    <w:lsdException w:name="toc 1" w:semiHidden="1" w:uiPriority="39" w:unhideWhenUsed="1"/>
+    <w:lsdException w:name="toc 2" w:semiHidden="1" w:uiPriority="39" w:unhideWhenUsed="1"/>
+    <w:lsdException w:name="toc 3" w:semiHidden="1" w:uiPriority="39" w:unhideWhenUsed="1"/>
+    <w:lsdException w:name="toc 4" w:semiHidden="1" w:uiPriority="39" w:unhideWhenUsed="1"/>
+    <w:lsdException w:name="toc 5" w:semiHidden="1" w:uiPriority="39" w:unhideWhenUsed="1"/>
+    <w:lsdException w:name="toc 6" w:semiHidden="1" w:uiPriority="39" w:unhideWhenUsed="1"/>
+    <w:lsdException w:name="toc 7" w:semiHidden="1" w:uiPriority="39" w:unhideWhenUsed="1"/>
+    <w:lsdException w:name="toc 8" w:semiHidden="1" w:uiPriority="39" w:unhideWhenUsed="1"/>
+    <w:lsdException w:name="toc 9" w:semiHidden="1" w:uiPriority="39" w:unhideWhenUsed="1"/>
+    <w:lsdException w:name="Normal Indent" w:semiHidden="1" w:unhideWhenUsed="1"/>
+    <w:lsdException w:name="footnote text" w:semiHidden="1" w:unhideWhenUsed="1"/>
+    <w:lsdException w:name="annotation text" w:semiHidden="1" w:unhideWhenUsed="1"/>
+    <w:lsdException w:name="header" w:semiHidden="1" w:unhideWhenUsed="1"/>
+    <w:lsdException w:name="footer" w:semiHidden="1" w:unhideWhenUsed="1"/>
+    <w:lsdException w:name="index heading" w:semiHidden="1" w:unhideWhenUsed="1"/>
+    <w:lsdException w:name="caption" w:semiHidden="1" w:uiPriority="35" w:unhideWhenUsed="1" w:qFormat="1"/>
+    <w:lsdException w:name="table of figures" w:semiHidden="1" w:unhideWhenUsed="1"/>
+    <w:lsdException w:name="envelope address" w:semiHidden="1" w:unhideWhenUsed="1"/>
+    <w:lsdException w:name="envelope return" w:semiHidden="1" w:unhideWhenUsed="1"/>
+    <w:lsdException w:name="footnote reference" w:semiHidden="1" w:unhideWhenUsed="1"/>
+    <w:lsdException w:name="annotation reference" w:semiHidden="1" w:unhideWhenUsed="1"/>
+    <w:lsdException w:name="line number" w:semiHidden="1" w:unhideWhenUsed="1"/>
+    <w:lsdException w:name="page number" w:semiHidden="1" w:unhideWhenUsed="1"/>
+    <w:lsdException w:name="endnote reference" w:semiHidden="1" w:unhideWhenUsed="1"/>
+    <w:lsdException w:name="endnote text" w:semiHidden="1" w:unhideWhenUsed="1"/>
+    <w:lsdException w:name="table of authorities" w:semiHidden="1" w:unhideWhenUsed="1"/>
+    <w:lsdException w:name="macro" w:semiHidden="1" w:unhideWhenUsed="1"/>
+    <w:lsdException w:name="toa heading" w:semiHidden="1" w:unhideWhenUsed="1"/>
+    <w:lsdException w:name="List" w:semiHidden="1" w:unhideWhenUsed="1"/>
+    <w:lsdException w:name="List Bullet" w:semiHidden="1" w:unhideWhenUsed="1"/>
+    <w:lsdException w:name="List Number" w:semiHidden="1" w:unhideWhenUsed="1"/>
+    <w:lsdException w:name="List 2" w:semiHidden="1" w:unhideWhenUsed="1"/>
+    <w:lsdException w:name="List 3" w:semiHidden="1" w:unhideWhenUsed="1"/>
+    <w:lsdException w:name="List 4" w:semiHidden="1" w:unhideWhenUsed="1"/>
+    <w:lsdException w:name="List 5" w:semiHidden="1" w:unhideWhenUsed="1"/>
+    <w:lsdException w:name="List Bullet 2" w:semiHidden="1" w:unhideWhenUsed="1"/>
+    <w:lsdException w:name="List Bullet 3" w:semiHidden="1" w:unhideWhenUsed="1"/>
+    <w:lsdException w:name="List Bullet 4" w:semiHidden="1" w:unhideWhenUsed="1"/>
+    <w:lsdException w:name="List Bullet 5" w:semiHidden="1" w:unhideWhenUsed="1"/>
+    <w:lsdException w:name="List Number 2" w:semiHidden="1" w:unhideWhenUsed="1"/>
+    <w:lsdException w:name="List Number 3" w:semiHidden="1" w:unhideWhenUsed="1"/>
+    <w:lsdException w:name="List Number 4" w:semiHidden="1" w:unhideWhenUsed="1"/>
+    <w:lsdException w:name="List Number 5" w:semiHidden="1" w:unhideWhenUsed="1"/>
+    <w:lsdException w:name="Title" w:uiPriority="10" w:qFormat="1"/>
+    <w:lsdException w:name="Closing" w:semiHidden="1" w:unhideWhenUsed="1"/>
+    <w:lsdException w:name="Signature" w:semiHidden="1" w:unhideWhenUsed="1"/>
+    <w:lsdException w:name="Default Paragraph Font" w:semiHidden="1" w:uiPriority="1" w:unhideWhenUsed="1"/>
+    <w:lsdException w:name="Body Text" w:semiHidden="1" w:unhideWhenUsed="1"/>
+    <w:lsdException w:name="Body Text Indent" w:semiHidden="1" w:unhideWhenUsed="1"/>
+    <w:lsdException w:name="List Continue" w:semiHidden="1" w:unhideWhenUsed="1"/>
+    <w:lsdException w:name="List Continue 2" w:semiHidden="1" w:unhideWhenUsed="1"/>
+    <w:lsdException w:name="List Continue 3" w:semiHidden="1" w:unhideWhenUsed="1"/>
+    <w:lsdException w:name="List Continue 4" w:semiHidden="1" w:unhideWhenUsed="1"/>
+    <w:lsdException w:name="List Continue 5" w:semiHidden="1" w:unhideWhenUsed="1"/>
+    <w:lsdException w:name="Message Header" w:semiHidden="1" w:unhideWhenUsed="1"/>
+    <w:lsdException w:name="Subtitle" w:uiPriority="11" w:qFormat="1"/>
+    <w:lsdException w:name="Salutation" w:semiHidden="1" w:unhideWhenUsed="1"/>
+    <w:lsdException w:name="Date" w:semiHidden="1" w:unhideWhenUsed="1"/>
+    <w:lsdException w:name="Body Text First Indent" w:semiHidden="1" w:unhideWhenUsed="1"/>
+    <w:lsdException w:name="Body Text First Indent 2" w:semiHidden="1" w:unhideWhenUsed="1"/>
+    <w:lsdException w:name="Note Heading" w:semiHidden="1" w:unhideWhenUsed="1"/>
+    <w:lsdException w:name="Body Text 2" w:semiHidden="1" w:unhideWhenUsed="1"/>
+    <w:lsdException w:name="Body Text 3" w:semiHidden="1" w:unhideWhenUsed="1"/>
+    <w:lsdException w:name="Body Text Indent 2" w:semiHidden="1" w:unhideWhenUsed="1"/>
+    <w:lsdException w:name="Body Text Indent 3" w:semiHidden="1" w:unhideWhenUsed="1"/>
+    <w:lsdException w:name="Block Text" w:semiHidden="1" w:unhideWhenUsed="1"/>
+    <w:lsdException w:name="Hyperlink" w:semiHidden="1" w:unhideWhenUsed="1"/>
+    <w:lsdException w:name="FollowedHyperlink" w:semiHidden="1" w:unhideWhenUsed="1"/>
+    <w:lsdException w:name="Strong" w:uiPriority="22" w:qFormat="1"/>
+    <w:lsdException w:name="Emphasis" w:uiPriority="20" w:qFormat="1"/>
+    <w:lsdException w:name="Document Map" w:semiHidden="1" w:unhideWhenUsed="1"/>
+    <w:lsdException w:name="Plain Text" w:semiHidden="1" w:unhideWhenUsed="1"/>
+    <w:lsdException w:name="E-mail Signature" w:semiHidden="1" w:unhideWhenUsed="1"/>
+    <w:lsdException w:name="HTML Top of Form" w:semiHidden="1" w:unhideWhenUsed="1"/>
+    <w:lsdException w:name="HTML Bottom of Form" w:semiHidden="1" w:unhideWhenUsed="1"/>
+    <w:lsdException w:name="Normal (Web)" w:semiHidden="1" w:unhideWhenUsed="1"/>
+    <w:lsdException w:name="HTML Acronym" w:semiHidden="1" w:unhideWhenUsed="1"/>
+    <w:lsdException w:name="HTML Address" w:semiHidden="1" w:unhideWhenUsed="1"/>
+    <w:lsdException w:name="HTML Cite" w:semiHidden="1" w:unhideWhenUsed="1"/>
+    <w:lsdException w:name="HTML Code" w:semiHidden="1" w:unhideWhenUsed="1"/>
+    <w:lsdException w:name="HTML Definition" w:semiHidden="1" w:unhideWhenUsed="1"/>
+    <w:lsdException w:name="HTML Keyboard" w:semiHidden="1" w:unhideWhenUsed="1"/>
+    <w:lsdException w:name="HTML Preformatted" w:semiHidden="1" w:unhideWhenUsed="1"/>
+    <w:lsdException w:name="HTML Sample" w:semiHidden="1" w:unhideWhenUsed="1"/>
+    <w:lsdException w:name="HTML Typewriter" w:semiHidden="1" w:unhideWhenUsed="1"/>
+    <w:lsdException w:name="HTML Variable" w:semiHidden="1" w:unhideWhenUsed="1"/>
+    <w:lsdException w:name="Normal Table" w:semiHidden="1" w:unhideWhenUsed="1"/>
+    <w:lsdException w:name="annotation subject" w:semiHidden="1" w:unhideWhenUsed="1"/>
+    <w:lsdException w:name="No List" w:semiHidden="1" w:unhideWhenUsed="1"/>
+    <w:lsdException w:name="Outline List 1" w:semiHidden="1" w:unhideWhenUsed="1"/>
+    <w:lsdException w:name="Outline List 2" w:semiHidden="1" w:unhideWhenUsed="1"/>
+    <w:lsdException w:name="Outline List 3" w:semiHidden="1" w:unhideWhenUsed="1"/>
+    <w:lsdException w:name="Table Simple 1" w:semiHidden="1" w:unhideWhenUsed="1"/>
+    <w:lsdException w:name="Table Simple 2" w:semiHidden="1" w:unhideWhenUsed="1"/>
+    <w:lsdException w:name="Table Simple 3" w:semiHidden="1" w:unhideWhenUsed="1"/>
+    <w:lsdException w:name="Table Classic 1" w:semiHidden="1" w:unhideWhenUsed="1"/>
+    <w:lsdException w:name="Table Classic 2" w:semiHidden="1" w:unhideWhenUsed="1"/>
+    <w:lsdException w:name="Table Classic 3" w:semiHidden="1" w:unhideWhenUsed="1"/>
+    <w:lsdException w:name="Table Classic 4" w:semiHidden="1" w:unhideWhenUsed="1"/>
+    <w:lsdException w:name="Table Colorful 1" w:semiHidden="1" w:unhideWhenUsed="1"/>
+    <w:lsdException w:name="Table Colorful 2" w:semiHidden="1" w:unhideWhenUsed="1"/>
+    <w:lsdException w:name="Table Colorful 3" w:semiHidden="1" w:unhideWhenUsed="1"/>
+    <w:lsdException w:name="Table Columns 1" w:semiHidden="1" w:unhideWhenUsed="1"/>
+    <w:lsdException w:name="Table Columns 2" w:semiHidden="1" w:unhideWhenUsed="1"/>
+    <w:lsdException w:name="Table Columns 3" w:semiHidden="1" w:unhideWhenUsed="1"/>
+    <w:lsdException w:name="Table Columns 4" w:semiHidden="1" w:unhideWhenUsed="1"/>
+    <w:lsdException w:name="Table Columns 5" w:semiHidden="1" w:unhideWhenUsed="1"/>
+    <w:lsdException w:name="Table Grid 1" w:semiHidden="1" w:unhideWhenUsed="1"/>
+    <w:lsdException w:name="Table Grid 2" w:semiHidden="1" w:unhideWhenUsed="1"/>
+    <w:lsdException w:name="Table Grid 3" w:semiHidden="1" w:unhideWhenUsed="1"/>
+    <w:lsdException w:name="Table Grid 4" w:semiHidden="1" w:unhideWhenUsed="1"/>
+    <w:lsdException w:name="Table Grid 5" w:semiHidden="1" w:unhideWhenUsed="1"/>
+    <w:lsdException w:name="Table Grid 6" w:semiHidden="1" w:unhideWhenUsed="1"/>
+    <w:lsdException w:name="Table Grid 7" w:semiHidden="1" w:unhideWhenUsed="1"/>
+    <w:lsdException w:name="Table Grid 8" w:semiHidden="1" w:unhideWhenUsed="1"/>
+    <w:lsdException w:name="Table List 1" w:semiHidden="1" w:unhideWhenUsed="1"/>
+    <w:lsdException w:name="Table List 2" w:semiHidden="1" w:unhideWhenUsed="1"/>
+    <w:lsdException w:name="Table List 3" w:semiHidden="1" w:unhideWhenUsed="1"/>
+    <w:lsdException w:name="Table List 4" w:semiHidden="1" w:unhideWhenUsed="1"/>
+    <w:lsdException w:name="Table List 5" w:semiHidden="1" w:unhideWhenUsed="1"/>
+    <w:lsdException w:name="Table List 6" w:semiHidden="1" w:unhideWhenUsed="1"/>
+    <w:lsdException w:name="Table List 7" w:semiHidden="1" w:unhideWhenUsed="1"/>
+    <w:lsdException w:name="Table List 8" w:semiHidden="1" w:unhideWhenUsed="1"/>
+    <w:lsdException w:name="Table 3D effects 1" w:semiHidden="1" w:unhideWhenUsed="1"/>
+    <w:lsdException w:name="Table 3D effects 2" w:semiHidden="1" w:unhideWhenUsed="1"/>
+    <w:lsdException w:name="Table 3D effects 3" w:semiHidden="1" w:unhideWhenUsed="1"/>
+    <w:lsdException w:name="Table Contemporary" w:semiHidden="1" w:unhideWhenUsed="1"/>
+    <w:lsdException w:name="Table Elegant" w:semiHidden="1" w:unhideWhenUsed="1"/>
+    <w:lsdException w:name="Table Professional" w:semiHidden="1" w:unhideWhenUsed="1"/>
+    <w:lsdException w:name="Table Subtle 1" w:semiHidden="1" w:unhideWhenUsed="1"/>
+    <w:lsdException w:name="Table Subtle 2" w:semiHidden="1" w:unhideWhenUsed="1"/>
+    <w:lsdException w:name="Table Web 1" w:semiHidden="1" w:unhideWhenUsed="1"/>
+    <w:lsdException w:name="Table Web 2" w:semiHidden="1" w:unhideWhenUsed="1"/>
+    <w:lsdException w:name="Table Web 3" w:semiHidden="1" w:unhideWhenUsed="1"/>
+    <w:lsdException w:name="Balloon Text" w:semiHidden="1" w:unhideWhenUsed="1"/>
+    <w:lsdException w:name="Table Grid" w:uiPriority="39"/>
+    <w:lsdException w:name="Table Theme" w:semiHidden="1" w:unhideWhenUsed="1"/>
+    <w:lsdException w:name="Placeholder Text" w:semiHidden="1"/>
+    <w:lsdException w:name="No Spacing" w:uiPriority="1" w:qFormat="1"/>
+    <w:lsdException w:name="Light Shading" w:uiPriority="60"/>
+    <w:lsdException w:name="Light List" w:uiPriority="61"/>
+    <w:lsdException w:name="Light Grid" w:uiPriority="62"/>
+    <w:lsdException w:name="Medium Shading 1" w:uiPriority="63"/>
+    <w:lsdException w:name="Medium Shading 2" w:uiPriority="64"/>
+    <w:lsdException w:name="Medium List 1" w:uiPriority="65"/>
+    <w:lsdException w:name="Medium List 2" w:uiPriority="66"/>
+    <w:lsdException w:name="Medium Grid 1" w:uiPriority="67"/>
+    <w:lsdException w:name="Medium Grid 2" w:uiPriority="68"/>
+    <w:lsdException w:name="Medium Grid 3" w:uiPriority="69"/>
+    <w:lsdException w:name="Dark List" w:uiPriority="70"/>
+    <w:lsdException w:name="Colorful Shading" w:uiPriority="71"/>
+    <w:lsdException w:name="Colorful List" w:uiPriority="72"/>
+    <w:lsdException w:name="Colorful Grid" w:uiPriority="73"/>
+    <w:lsdException w:name="Light Shading Accent 1" w:uiPriority="60"/>
+    <w:lsdException w:name="Light List Accent 1" w:uiPriority="61"/>
+    <w:lsdException w:name="Light Grid Accent 1" w:uiPriority="62"/>
+    <w:lsdException w:name="Medium Shading 1 Accent 1" w:uiPriority="63"/>
+    <w:lsdException w:name="Medium Shading 2 Accent 1" w:uiPriority="64"/>
+    <w:lsdException w:name="Medium List 1 Accent 1" w:uiPriority="65"/>
+    <w:lsdException w:name="Revision" w:semiHidden="1"/>
+    <w:lsdException w:name="List Paragraph" w:uiPriority="34" w:qFormat="1"/>
+    <w:lsdException w:name="Quote" w:uiPriority="29" w:qFormat="1"/>
+    <w:lsdException w:name="Intense Quote" w:uiPriority="30" w:qFormat="1"/>
+    <w:lsdException w:name="Medium List 2 Accent 1" w:uiPriority="66"/>
+    <w:lsdException w:name="Medium Grid 1 Accent 1" w:uiPriority="67"/>
+    <w:lsdException w:name="Medium Grid 2 Accent 1" w:uiPriority="68"/>
+    <w:lsdException w:name="Medium Grid 3 Accent 1" w:uiPriority="69"/>
+    <w:lsdException w:name="Dark List Accent 1" w:uiPriority="70"/>
+    <w:lsdException w:name="Colorful Shading Accent 1" w:uiPriority="71"/>
+    <w:lsdException w:name="Colorful List Accent 1" w:uiPriority="72"/>
+    <w:lsdException w:name="Colorful Grid Accent 1" w:uiPriority="73"/>
+    <w:lsdException w:name="Light Shading Accent 2" w:uiPriority="60"/>
+    <w:lsdException w:name="Light List Accent 2" w:uiPriority="61"/>
+    <w:lsdException w:name="Light Grid Accent 2" w:uiPriority="62"/>
+    <w:lsdException w:name="Medium Shading 1 Accent 2" w:uiPriority="63"/>
+    <w:lsdException w:name="Medium Shading 2 Accent 2" w:uiPriority="64"/>
+    <w:lsdException w:name="Medium List 1 Accent 2" w:uiPriority="65"/>
+    <w:lsdException w:name="Medium List 2 Accent 2" w:uiPriority="66"/>
+    <w:lsdException w:name="Medium Grid 1 Accent 2" w:uiPriority="67"/>
+    <w:lsdException w:name="Medium Grid 2 Accent 2" w:uiPriority="68"/>
+    <w:lsdException w:name="Medium Grid 3 Accent 2" w:uiPriority="69"/>
+    <w:lsdException w:name="Dark List Accent 2" w:uiPriority="70"/>
+    <w:lsdException w:name="Colorful Shading Accent 2" w:uiPriority="71"/>
+    <w:lsdException w:name="Colorful List Accent 2" w:uiPriority="72"/>
+    <w:lsdException w:name="Colorful Grid Accent 2" w:uiPriority="73"/>
+    <w:lsdException w:name="Light Shading Accent 3" w:uiPriority="60"/>
+    <w:lsdException w:name="Light List Accent 3" w:uiPriority="61"/>
+    <w:lsdException w:name="Light Grid Accent 3" w:uiPriority="62"/>
+    <w:lsdException w:name="Medium Shading 1 Accent 3" w:uiPriority="63"/>
+    <w:lsdException w:name="Medium Shading 2 Accent 3" w:uiPriority="64"/>
+    <w:lsdException w:name="Medium List 1 Accent 3" w:uiPriority="65"/>
+    <w:lsdException w:name="Medium List 2 Accent 3" w:uiPriority="66"/>
+    <w:lsdException w:name="Medium Grid 1 Accent 3" w:uiPriority="67"/>
+    <w:lsdException w:name="Medium Grid 2 Accent 3" w:uiPriority="68"/>
+    <w:lsdException w:name="Medium Grid 3 Accent 3" w:uiPriority="69"/>
+    <w:lsdException w:name="Dark List Accent 3" w:uiPriority="70"/>
+    <w:lsdException w:name="Colorful Shading Accent 3" w:uiPriority="71"/>
+    <w:lsdException w:name="Colorful List Accent 3" w:uiPriority="72"/>
+    <w:lsdException w:name="Colorful Grid Accent 3" w:uiPriority="73"/>
+    <w:lsdException w:name="Light Shading Accent 4" w:uiPriority="60"/>
+    <w:lsdException w:name="Light List Accent 4" w:uiPriority="61"/>
+    <w:lsdException w:name="Light Grid Accent 4" w:uiPriority="62"/>
+    <w:lsdException w:name="Medium Shading 1 Accent 4" w:uiPriority="63"/>
+    <w:lsdException w:name="Medium Shading 2 Accent 4" w:uiPriority="64"/>
+    <w:lsdException w:name="Medium List 1 Accent 4" w:uiPriority="65"/>
+    <w:lsdException w:name="Medium List 2 Accent 4" w:uiPriority="66"/>
+    <w:lsdException w:name="Medium Grid 1 Accent 4" w:uiPriority="67"/>
+    <w:lsdException w:name="Medium Grid 2 Accent 4" w:uiPriority="68"/>
+    <w:lsdException w:name="Medium Grid 3 Accent 4" w:uiPriority="69"/>
+    <w:lsdException w:name="Dark List Accent 4" w:uiPriority="70"/>
+    <w:lsdException w:name="Colorful Shading Accent 4" w:uiPriority="71"/>
+    <w:lsdException w:name="Colorful List Accent 4" w:uiPriority="72"/>
+    <w:lsdException w:name="Colorful Grid Accent 4" w:uiPriority="73"/>
+    <w:lsdException w:name="Light Shading Accent 5" w:uiPriority="60"/>
+    <w:lsdException w:name="Light List Accent 5" w:uiPriority="61"/>
+    <w:lsdException w:name="Light Grid Accent 5" w:uiPriority="62"/>
+    <w:lsdException w:name="Medium Shading 1 Accent 5" w:uiPriority="63"/>
+    <w:lsdException w:name="Medium Shading 2 Accent 5" w:uiPriority="64"/>
+    <w:lsdException w:name="Medium List 1 Accent 5" w:uiPriority="65"/>
+    <w:lsdException w:name="Medium List 2 Accent 5" w:uiPriority="66"/>
+    <w:lsdException w:name="Medium Grid 1 Accent 5" w:uiPriority="67"/>
+    <w:lsdException w:name="Medium Grid 2 Accent 5" w:uiPriority="68"/>
+    <w:lsdException w:name="Medium Grid 3 Accent 5" w:uiPriority="69"/>
+    <w:lsdException w:name="Dark List Accent 5" w:uiPriority="70"/>
+    <w:lsdException w:name="Colorful Shading Accent 5" w:uiPriority="71"/>
+    <w:lsdException w:name="Colorful List Accent 5" w:uiPriority="72"/>
+    <w:lsdException w:name="Colorful Grid Accent 5" w:uiPriority="73"/>
+    <w:lsdException w:name="Light Shading Accent 6" w:uiPriority="60"/>
+    <w:lsdException w:name="Light List Accent 6" w:uiPriority="61"/>
+    <w:lsdException w:name="Light Grid Accent 6" w:uiPriority="62"/>
+    <w:lsdException w:name="Medium Shading 1 Accent 6" w:uiPriority="63"/>
+    <w:lsdException w:name="Medium Shading 2 Accent 6" w:uiPriority="64"/>
+    <w:lsdException w:name="Medium List 1 Accent 6" w:uiPriority="65"/>
+    <w:lsdException w:name="Medium List 2 Accent 6" w:uiPriority="66"/>
+    <w:lsdException w:name="Medium Grid 1 Accent 6" w:uiPriority="67"/>
+    <w:lsdException w:name="Medium Grid 2 Accent 6" w:uiPriority="68"/>
+    <w:lsdException w:name="Medium Grid 3 Accent 6" w:uiPriority="69"/>
+    <w:lsdException w:name="Dark List Accent 6" w:uiPriority="70"/>
+    <w:lsdException w:name="Colorful Shading Accent 6" w:uiPriority="71"/>
+    <w:lsdException w:name="Colorful List Accent 6" w:uiPriority="72"/>
+    <w:lsdException w:name="Colorful Grid Accent 6" w:uiPriority="73"/>
+    <w:lsdException w:name="Subtle Emphasis" w:uiPriority="19" w:qFormat="1"/>
+    <w:lsdException w:name="Intense Emphasis" w:uiPriority="21" w:qFormat="1"/>
+    <w:lsdException w:name="Subtle Reference" w:uiPriority="31" w:qFormat="1"/>
+    <w:lsdException w:name="Intense Reference" w:uiPriority="32" w:qFormat="1"/>
+    <w:lsdException w:name="Book Title" w:uiPriority="33" w:qFormat="1"/>
+    <w:lsdException w:name="Bibliography" w:semiHidden="1" w:uiPriority="37" w:unhideWhenUsed="1"/>
+    <w:lsdException w:name="TOC Heading" w:semiHidden="1" w:uiPriority="39" w:unhideWhenUsed="1" w:qFormat="1"/>
+    <w:lsdException w:name="Plain Table 1" w:uiPriority="41"/>
+    <w:lsdException w:name="Plain Table 2" w:uiPriority="42"/>
+    <w:lsdException w:name="Plain Table 3" w:uiPriority="43"/>
+    <w:lsdException w:name="Plain Table 4" w:uiPriority="44"/>
+    <w:lsdException w:name="Plain Table 5" w:uiPriority="45"/>
+    <w:lsdException w:name="Grid Table Light" w:uiPriority="40"/>
+    <w:lsdException w:name="Grid Table 1 Light" w:uiPriority="46"/>
+    <w:lsdException w:name="Grid Table 2" w:uiPriority="47"/>
+    <w:lsdException w:name="Grid Table 3" w:uiPriority="48"/>
+    <w:lsdException w:name="Grid Table 4" w:uiPriority="49"/>
+    <w:lsdException w:name="Grid Table 5 Dark" w:uiPriority="50"/>
+    <w:lsdException w:name="Grid Table 6 Colorful" w:uiPriority="51"/>
+    <w:lsdException w:name="Grid Table 7 Colorful" w:uiPriority="52"/>
+    <w:lsdException w:name="Grid Table 1 Light Accent 1" w:uiPriority="46"/>
+    <w:lsdException w:name="Grid Table 2 Accent 1" w:uiPriority="47"/>
+    <w:lsdException w:name="Grid Table 3 Accent 1" w:uiPriority="48"/>
+    <w:lsdException w:name="Grid Table 4 Accent 1" w:uiPriority="49"/>
+    <w:lsdException w:name="Grid Table 5 Dark Accent 1" w:uiPriority="50"/>
+    <w:lsdException w:name="Grid Table 6 Colorful Accent 1" w:uiPriority="51"/>
+    <w:lsdException w:name="Grid Table 7 Colorful Accent 1" w:uiPriority="52"/>
+    <w:lsdException w:name="Grid Table 1 Light Accent 2" w:uiPriority="46"/>
+    <w:lsdException w:name="Grid Table 2 Accent 2" w:uiPriority="47"/>
+    <w:lsdException w:name="Grid Table 3 Accent 2" w:uiPriority="48"/>
+    <w:lsdException w:name="Grid Table 4 Accent 2" w:uiPriority="49"/>
+    <w:lsdException w:name="Grid Table 5 Dark Accent 2" w:uiPriority="50"/>
+    <w:lsdException w:name="Grid Table 6 Colorful Accent 2" w:uiPriority="51"/>
+    <w:lsdException w:name="Grid Table 7 Colorful Accent 2" w:uiPriority="52"/>
+    <w:lsdException w:name="Grid Table 1 Light Accent 3" w:uiPriority="46"/>
+    <w:lsdException w:name="Grid Table 2 Accent 3" w:uiPriority="47"/>
+    <w:lsdException w:name="Grid Table 3 Accent 3" w:uiPriority="48"/>
+    <w:lsdException w:name="Grid Table 4 Accent 3" w:uiPriority="49"/>
+    <w:lsdException w:name="Grid Table 5 Dark Accent 3" w:uiPriority="50"/>
+    <w:lsdException w:name="Grid Table 6 Colorful Accent 3" w:uiPriority="51"/>
+    <w:lsdException w:name="Grid Table 7 Colorful Accent 3" w:uiPriority="52"/>
+    <w:lsdException w:name="Grid Table 1 Light Accent 4" w:uiPriority="46"/>
+    <w:lsdException w:name="Grid Table 2 Accent 4" w:uiPriority="47"/>
+    <w:lsdException w:name="Grid Table 3 Accent 4" w:uiPriority="48"/>
+    <w:lsdException w:name="Grid Table 4 Accent 4" w:uiPriority="49"/>
+    <w:lsdException w:name="Grid Table 5 Dark Accent 4" w:uiPriority="50"/>
+    <w:lsdException w:name="Grid Table 6 Colorful Accent 4" w:uiPriority="51"/>
+    <w:lsdException w:name="Grid Table 7 Colorful Accent 4" w:uiPriority="52"/>
+    <w:lsdException w:name="Grid Table 1 Light Accent 5" w:uiPriority="46"/>
+    <w:lsdException w:name="Grid Table 2 Accent 5" w:uiPriority="47"/>
+    <w:lsdException w:name="Grid Table 3 Accent 5" w:uiPriority="48"/>
+    <w:lsdException w:name="Grid Table 4 Accent 5" w:uiPriority="49"/>
+    <w:lsdException w:name="Grid Table 5 Dark Accent 5" w:uiPriority="50"/>
+    <w:lsdException w:name="Grid Table 6 Colorful Accent 5" w:uiPriority="51"/>
+    <w:lsdException w:name="Grid Table 7 Colorful Accent 5" w:uiPriority="52"/>
+    <w:lsdException w:name="Grid Table 1 Light Accent 6" w:uiPriority="46"/>
+    <w:lsdException w:name="Grid Table 2 Accent 6" w:uiPriority="47"/>
+    <w:lsdException w:name="Grid Table 3 Accent 6" w:uiPriority="48"/>
+    <w:lsdException w:name="Grid Table 4 Accent 6" w:uiPriority="49"/>
+    <w:lsdException w:name="Grid Table 5 Dark Accent 6" w:uiPriority="50"/>
+    <w:lsdException w:name="Grid Table 6 Colorful Accent 6" w:uiPriority="51"/>
+    <w:lsdException w:name="Grid Table 7 Colorful Accent 6" w:uiPriority="52"/>
+    <w:lsdException w:name="List Table 1 Light" w:uiPriority="46"/>
+    <w:lsdException w:name="List Table 2" w:uiPriority="47"/>
+    <w:lsdException w:name="List Table 3" w:uiPriority="48"/>
+    <w:lsdException w:name="List Table 4" w:uiPriority="49"/>
+    <w:lsdException w:name="List Table 5 Dark" w:uiPriority="50"/>
+    <w:lsdException w:name="List Table 6 Colorful" w:uiPriority="51"/>
+    <w:lsdException w:name="List Table 7 Colorful" w:uiPriority="52"/>
+    <w:lsdException w:name="List Table 1 Light Accent 1" w:uiPriority="46"/>
+    <w:lsdException w:name="List Table 2 Accent 1" w:uiPriority="47"/>
+    <w:lsdException w:name="List Table 3 Accent 1" w:uiPriority="48"/>
+    <w:lsdException w:name="List Table 4 Accent 1" w:uiPriority="49"/>
+    <w:lsdException w:name="List Table 5 Dark Accent 1" w:uiPriority="50"/>
+    <w:lsdException w:name="List Table 6 Colorful Accent 1" w:uiPriority="51"/>
+    <w:lsdException w:name="List Table 7 Colorful Accent 1" w:uiPriority="52"/>
+    <w:lsdException w:name="List Table 1 Light Accent 2" w:uiPriority="46"/>
+    <w:lsdException w:name="List Table 2 Accent 2" w:uiPriority="47"/>
+    <w:lsdException w:name="List Table 3 Accent 2" w:uiPriority="48"/>
+    <w:lsdException w:name="List Table 4 Accent 2" w:uiPriority="49"/>
+    <w:lsdException w:name="List Table 5 Dark Accent 2" w:uiPriority="50"/>
+    <w:lsdException w:name="List Table 6 Colorful Accent 2" w:uiPriority="51"/>
+    <w:lsdException w:name="List Table 7 Colorful Accent 2" w:uiPriority="52"/>
+    <w:lsdException w:name="List Table 1 Light Accent 3" w:uiPriority="46"/>
+    <w:lsdException w:name="List Table 2 Accent 3" w:uiPriority="47"/>
+    <w:lsdException w:name="List Table 3 Accent 3" w:uiPriority="48"/>
+    <w:lsdException w:name="List Table 4 Accent 3" w:uiPriority="49"/>
+    <w:lsdException w:name="List Table 5 Dark Accent 3" w:uiPriority="50"/>
+    <w:lsdException w:name="List Table 6 Colorful Accent 3" w:uiPriority="51"/>
+    <w:lsdException w:name="List Table 7 Colorful Accent 3" w:uiPriority="52"/>
+    <w:lsdException w:name="List Table 1 Light Accent 4" w:uiPriority="46"/>
+    <w:lsdException w:name="List Table 2 Accent 4" w:uiPriority="47"/>
+    <w:lsdException w:name="List Table 3 Accent 4" w:uiPriority="48"/>
+    <w:lsdException w:name="List Table 4 Accent 4" w:uiPriority="49"/>
+    <w:lsdException w:name="List Table 5 Dark Accent 4" w:uiPriority="50"/>
+    <w:lsdException w:name="List Table 6 Colorful Accent 4" w:uiPriority="51"/>
+    <w:lsdException w:name="List Table 7 Colorful Accent 4" w:uiPriority="52"/>
+    <w:lsdException w:name="List Table 1 Light Accent 5" w:uiPriority="46"/>
+    <w:lsdException w:name="List Table 2 Accent 5" w:uiPriority="47"/>
+    <w:lsdException w:name="List Table 3 Accent 5" w:uiPriority="48"/>
+    <w:lsdException w:name="List Table 4 Accent 5" w:uiPriority="49"/>
+    <w:lsdException w:name="List Table 5 Dark Accent 5" w:uiPriority="50"/>
+    <w:lsdException w:name="List Table 6 Colorful Accent 5" w:uiPriority="51"/>
+    <w:lsdException w:name="List Table 7 Colorful Accent 5" w:uiPriority="52"/>
+    <w:lsdException w:name="List Table 1 Light Accent 6" w:uiPriority="46"/>
+    <w:lsdException w:name="List Table 2 Accent 6" w:uiPriority="47"/>
+    <w:lsdException w:name="List Table 3 Accent 6" w:uiPriority="48"/>
+    <w:lsdException w:name="List Table 4 Accent 6" w:uiPriority="49"/>
+    <w:lsdException w:name="List Table 5 Dark Accent 6" w:uiPriority="50"/>
+    <w:lsdException w:name="List Table 6 Colorful Accent 6" w:uiPriority="51"/>
+    <w:lsdException w:name="List Table 7 Colorful Accent 6" w:uiPriority="52"/>
+    <w:lsdException w:name="Mention" w:semiHidden="1" w:unhideWhenUsed="1"/>
+    <w:lsdException w:name="Smart Hyperlink" w:semiHidden="1" w:unhideWhenUsed="1"/>
+    <w:lsdException w:name="Hashtag" w:semiHidden="1" w:unhideWhenUsed="1"/>
+    <w:lsdException w:name="Unresolved Mention" w:semiHidden="1" w:unhideWhenUsed="1"/>
+    <w:lsdException w:name="Smart Link" w:semiHidden="1" w:unhideWhenUsed="1"/>
+  </w:latentStyles>
+  <w:style w:type="paragraph" w:default="1" w:styleId="Normal">
     <w:name w:val="Normal"/>
-    <w:qFormat w:val="1"/>
+    <w:qFormat/>
   </w:style>
   <w:style w:type="paragraph" w:styleId="Heading1">
     <w:name w:val="heading 1"/>
     <w:basedOn w:val="Normal"/>
     <w:next w:val="Normal"/>
     <w:uiPriority w:val="9"/>
-    <w:qFormat w:val="1"/>
+    <w:qFormat/>
     <w:pPr>
-      <w:keepNext w:val="1"/>
-      <w:keepLines w:val="1"/>
-      <w:spacing w:after="120" w:before="400"/>
+      <w:keepNext/>
+      <w:keepLines/>
+      <w:spacing w:before="400" w:after="120"/>
       <w:outlineLvl w:val="0"/>
     </w:pPr>
     <w:rPr>
@@ -251,13 +458,13 @@
     <w:basedOn w:val="Normal"/>
     <w:next w:val="Normal"/>
     <w:uiPriority w:val="9"/>
-    <w:semiHidden w:val="1"/>
-    <w:unhideWhenUsed w:val="1"/>
-    <w:qFormat w:val="1"/>
+    <w:semiHidden/>
+    <w:unhideWhenUsed/>
+    <w:qFormat/>
     <w:pPr>
-      <w:keepNext w:val="1"/>
-      <w:keepLines w:val="1"/>
-      <w:spacing w:after="120" w:before="360"/>
+      <w:keepNext/>
+      <w:keepLines/>
+      <w:spacing w:before="360" w:after="120"/>
       <w:outlineLvl w:val="1"/>
     </w:pPr>
     <w:rPr>
@@ -270,13 +477,13 @@
     <w:basedOn w:val="Normal"/>
     <w:next w:val="Normal"/>
     <w:uiPriority w:val="9"/>
-    <w:semiHidden w:val="1"/>
-    <w:unhideWhenUsed w:val="1"/>
-    <w:qFormat w:val="1"/>
+    <w:semiHidden/>
+    <w:unhideWhenUsed/>
+    <w:qFormat/>
     <w:pPr>
-      <w:keepNext w:val="1"/>
-      <w:keepLines w:val="1"/>
-      <w:spacing w:after="80" w:before="320"/>
+      <w:keepNext/>
+      <w:keepLines/>
+      <w:spacing w:before="320" w:after="80"/>
       <w:outlineLvl w:val="2"/>
     </w:pPr>
     <w:rPr>
@@ -290,13 +497,13 @@
     <w:basedOn w:val="Normal"/>
     <w:next w:val="Normal"/>
     <w:uiPriority w:val="9"/>
-    <w:semiHidden w:val="1"/>
-    <w:unhideWhenUsed w:val="1"/>
-    <w:qFormat w:val="1"/>
+    <w:semiHidden/>
+    <w:unhideWhenUsed/>
+    <w:qFormat/>
     <w:pPr>
-      <w:keepNext w:val="1"/>
-      <w:keepLines w:val="1"/>
-      <w:spacing w:after="80" w:before="280"/>
+      <w:keepNext/>
+      <w:keepLines/>
+      <w:spacing w:before="280" w:after="80"/>
       <w:outlineLvl w:val="3"/>
     </w:pPr>
     <w:rPr>
@@ -310,13 +517,13 @@
     <w:basedOn w:val="Normal"/>
     <w:next w:val="Normal"/>
     <w:uiPriority w:val="9"/>
-    <w:semiHidden w:val="1"/>
-    <w:unhideWhenUsed w:val="1"/>
-    <w:qFormat w:val="1"/>
+    <w:semiHidden/>
+    <w:unhideWhenUsed/>
+    <w:qFormat/>
     <w:pPr>
-      <w:keepNext w:val="1"/>
-      <w:keepLines w:val="1"/>
-      <w:spacing w:after="80" w:before="240"/>
+      <w:keepNext/>
+      <w:keepLines/>
+      <w:spacing w:before="240" w:after="80"/>
       <w:outlineLvl w:val="4"/>
     </w:pPr>
     <w:rPr>
@@ -328,56 +535,56 @@
     <w:basedOn w:val="Normal"/>
     <w:next w:val="Normal"/>
     <w:uiPriority w:val="9"/>
-    <w:semiHidden w:val="1"/>
-    <w:unhideWhenUsed w:val="1"/>
-    <w:qFormat w:val="1"/>
+    <w:semiHidden/>
+    <w:unhideWhenUsed/>
+    <w:qFormat/>
     <w:pPr>
-      <w:keepNext w:val="1"/>
-      <w:keepLines w:val="1"/>
-      <w:spacing w:after="80" w:before="240"/>
+      <w:keepNext/>
+      <w:keepLines/>
+      <w:spacing w:before="240" w:after="80"/>
       <w:outlineLvl w:val="5"/>
     </w:pPr>
     <w:rPr>
-      <w:i w:val="1"/>
+      <w:i/>
       <w:color w:val="666666"/>
     </w:rPr>
   </w:style>
-  <w:style w:type="character" w:styleId="DefaultParagraphFont" w:default="1">
+  <w:style w:type="character" w:default="1" w:styleId="DefaultParagraphFont">
     <w:name w:val="Default Paragraph Font"/>
     <w:uiPriority w:val="1"/>
-    <w:semiHidden w:val="1"/>
-    <w:unhideWhenUsed w:val="1"/>
-  </w:style>
-  <w:style w:type="table" w:styleId="TableNormal" w:default="1">
+    <w:semiHidden/>
+    <w:unhideWhenUsed/>
+  </w:style>
+  <w:style w:type="table" w:default="1" w:styleId="TableNormal">
     <w:name w:val="Normal Table"/>
     <w:uiPriority w:val="99"/>
-    <w:semiHidden w:val="1"/>
-    <w:unhideWhenUsed w:val="1"/>
+    <w:semiHidden/>
+    <w:unhideWhenUsed/>
     <w:tblPr>
-      <w:tblInd w:w="0.0" w:type="dxa"/>
+      <w:tblInd w:w="0" w:type="dxa"/>
       <w:tblCellMar>
-        <w:top w:w="0.0" w:type="dxa"/>
-        <w:left w:w="108.0" w:type="dxa"/>
-        <w:bottom w:w="0.0" w:type="dxa"/>
-        <w:right w:w="108.0" w:type="dxa"/>
+        <w:top w:w="0" w:type="dxa"/>
+        <w:left w:w="108" w:type="dxa"/>
+        <w:bottom w:w="0" w:type="dxa"/>
+        <w:right w:w="108" w:type="dxa"/>
       </w:tblCellMar>
     </w:tblPr>
   </w:style>
-  <w:style w:type="numbering" w:styleId="NoList" w:default="1">
+  <w:style w:type="numbering" w:default="1" w:styleId="NoList">
     <w:name w:val="No List"/>
     <w:uiPriority w:val="99"/>
-    <w:semiHidden w:val="1"/>
-    <w:unhideWhenUsed w:val="1"/>
+    <w:semiHidden/>
+    <w:unhideWhenUsed/>
   </w:style>
   <w:style w:type="paragraph" w:styleId="Title">
     <w:name w:val="Title"/>
     <w:basedOn w:val="Normal"/>
     <w:next w:val="Normal"/>
     <w:uiPriority w:val="10"/>
-    <w:qFormat w:val="1"/>
+    <w:qFormat/>
     <w:pPr>
-      <w:keepNext w:val="1"/>
-      <w:keepLines w:val="1"/>
+      <w:keepNext/>
+      <w:keepLines/>
       <w:spacing w:after="60"/>
     </w:pPr>
     <w:rPr>
@@ -390,26 +597,11 @@
     <w:basedOn w:val="Normal"/>
     <w:next w:val="Normal"/>
     <w:uiPriority w:val="11"/>
-    <w:qFormat w:val="1"/>
+    <w:qFormat/>
     <w:pPr>
-      <w:keepNext w:val="1"/>
-      <w:keepLines w:val="1"/>
+      <w:keepNext/>
+      <w:keepLines/>
       <w:spacing w:after="320"/>
-    </w:pPr>
-    <w:rPr>
-      <w:color w:val="666666"/>
-      <w:sz w:val="30"/>
-      <w:szCs w:val="30"/>
-    </w:rPr>
-  </w:style>
-  <w:style w:type="paragraph" w:styleId="Subtitle">
-    <w:name w:val="Subtitle"/>
-    <w:basedOn w:val="Normal"/>
-    <w:next w:val="Normal"/>
-    <w:pPr>
-      <w:keepNext w:val="1"/>
-      <w:keepLines w:val="1"/>
-      <w:spacing w:after="320" w:lineRule="auto"/>
     </w:pPr>
     <w:rPr>
       <w:color w:val="666666"/>
@@ -738,19 +930,4 @@
   </a:objectDefaults>
   <a:extraClrSchemeLst/>
 </a:theme>
-</file>
-
-<file path=customXML/item1.xml><?xml version="1.0" encoding="utf-8"?>
-<go:gDocsCustomXmlDataStorage xmlns:go="http://customooxmlschemas.google.com/" xmlns:r="http://schemas.openxmlformats.org/officeDocument/2006/relationships" uri="GoogleDocsCustomDataVersion2">
-  <go:docsCustomData xmlns:go="http://customooxmlschemas.google.com/" roundtripDataSignature="AMtx7mjOlMZacMVZsl+BnKqrpR9EM+kzRw==">CgMxLjA4AHIhMVNWem1acjBTdFoyN2tEVlVnampWbWdYSWNrVUJxT01w</go:docsCustomData>
-</go:gDocsCustomXmlDataStorage>
-</file>
-
-<file path=customXML/itemProps1.xml><?xml version="1.0" encoding="utf-8"?>
-<ds:datastoreItem xmlns:ds="http://schemas.openxmlformats.org/officeDocument/2006/customXml" ds:itemID="{11111111-1234-1234-1234-123412341234}">
-  <ds:schemaRefs>
-    <ds:schemaRef ds:uri="http://schemas.openxmlformats.org/officeDocument/2006/relationships"/>
-    <ds:schemaRef ds:uri="http://customooxmlschemas.google.com/"/>
-  </ds:schemaRefs>
-</ds:datastoreItem>
 </file>
</xml_diff>